<commit_message>
edit word to add URL GitHub
</commit_message>
<xml_diff>
--- a/WEB.docx
+++ b/WEB.docx
@@ -170,19 +170,8 @@
           <w:szCs w:val="44"/>
           <w:lang w:bidi="ar-SY"/>
         </w:rPr>
-        <w:t xml:space="preserve">Dr. Bassel Mustaffa </w:t>
+        <w:t>Dr. Bassel Mustaffa alkhatib</w:t>
       </w:r>
-      <w:proofErr w:type="spellStart"/>
-      <w:r>
-        <w:rPr>
-          <w:color w:val="1F4E79" w:themeColor="accent1" w:themeShade="80"/>
-          <w:sz w:val="44"/>
-          <w:szCs w:val="44"/>
-          <w:lang w:bidi="ar-SY"/>
-        </w:rPr>
-        <w:t>alkhatib</w:t>
-      </w:r>
-      <w:proofErr w:type="spellEnd"/>
     </w:p>
     <w:p>
       <w:pPr>
@@ -359,20 +348,8 @@
                 <w:szCs w:val="36"/>
                 <w:rtl/>
               </w:rPr>
-              <w:t xml:space="preserve">محمد عمر </w:t>
-            </w:r>
-            <w:proofErr w:type="spellStart"/>
-            <w:r>
-              <w:rPr>
-                <w:rFonts w:hint="cs"/>
-                <w:color w:val="000000" w:themeColor="text1"/>
-                <w:sz w:val="36"/>
-                <w:szCs w:val="36"/>
-                <w:rtl/>
-              </w:rPr>
-              <w:t>الربداوي</w:t>
-            </w:r>
-            <w:proofErr w:type="spellEnd"/>
+              <w:t>محمد عمر الربداوي</w:t>
+            </w:r>
           </w:p>
         </w:tc>
         <w:tc>
@@ -587,21 +564,8 @@
                 <w:rtl/>
                 <w:lang w:bidi="ar-SY"/>
               </w:rPr>
-              <w:t xml:space="preserve">محمد عماد الدين </w:t>
-            </w:r>
-            <w:proofErr w:type="spellStart"/>
-            <w:r>
-              <w:rPr>
-                <w:rFonts w:cs="Arial" w:hint="cs"/>
-                <w:color w:val="000000" w:themeColor="text1"/>
-                <w:sz w:val="36"/>
-                <w:szCs w:val="36"/>
-                <w:rtl/>
-                <w:lang w:bidi="ar-SY"/>
-              </w:rPr>
-              <w:t>دعدوش</w:t>
-            </w:r>
-            <w:proofErr w:type="spellEnd"/>
+              <w:t>محمد عماد الدين دعدوش</w:t>
+            </w:r>
           </w:p>
         </w:tc>
         <w:tc>
@@ -796,6 +760,7 @@
           <w:color w:val="1F3864" w:themeColor="accent5" w:themeShade="80"/>
           <w:sz w:val="72"/>
           <w:szCs w:val="72"/>
+          <w:rtl/>
         </w:rPr>
       </w:pPr>
       <w:r>
@@ -845,6 +810,30 @@
           <w:rtl/>
         </w:rPr>
         <w:t>:</w:t>
+      </w:r>
+    </w:p>
+    <w:p>
+      <w:pPr>
+        <w:jc w:val="center"/>
+        <w:rPr>
+          <w:rFonts w:ascii="Arabic Typesetting" w:hAnsi="Arabic Typesetting" w:cs="Arabic Typesetting"/>
+          <w:b/>
+          <w:bCs/>
+          <w:color w:val="1F3864" w:themeColor="accent5" w:themeShade="80"/>
+          <w:sz w:val="72"/>
+          <w:szCs w:val="72"/>
+        </w:rPr>
+      </w:pPr>
+      <w:r>
+        <w:rPr>
+          <w:rFonts w:ascii="Arabic Typesetting" w:hAnsi="Arabic Typesetting" w:cs="Arabic Typesetting"/>
+          <w:b/>
+          <w:bCs/>
+          <w:color w:val="1F3864" w:themeColor="accent5" w:themeShade="80"/>
+          <w:sz w:val="72"/>
+          <w:szCs w:val="72"/>
+        </w:rPr>
+        <w:t>github.com/mohammadalrebdawi/Kaspar_website</w:t>
       </w:r>
     </w:p>
     <w:sectPr>
@@ -989,6 +978,7 @@
     <w:lsdException w:name="HTML Sample" w:semiHidden="1" w:unhideWhenUsed="1"/>
     <w:lsdException w:name="HTML Typewriter" w:semiHidden="1" w:unhideWhenUsed="1"/>
     <w:lsdException w:name="HTML Variable" w:semiHidden="1" w:unhideWhenUsed="1"/>
+    <w:lsdException w:name="Normal Table" w:semiHidden="1" w:unhideWhenUsed="1"/>
     <w:lsdException w:name="annotation subject" w:semiHidden="1" w:unhideWhenUsed="1"/>
     <w:lsdException w:name="No List" w:semiHidden="1" w:unhideWhenUsed="1"/>
     <w:lsdException w:name="Outline List 1" w:semiHidden="1" w:unhideWhenUsed="1"/>
@@ -1031,8 +1021,11 @@
     <w:lsdException w:name="Table Contemporary" w:semiHidden="1" w:unhideWhenUsed="1"/>
     <w:lsdException w:name="Table Elegant" w:semiHidden="1" w:unhideWhenUsed="1"/>
     <w:lsdException w:name="Table Professional" w:semiHidden="1" w:unhideWhenUsed="1"/>
+    <w:lsdException w:name="Table Subtle 1" w:semiHidden="1" w:unhideWhenUsed="1"/>
     <w:lsdException w:name="Table Subtle 2" w:semiHidden="1" w:unhideWhenUsed="1"/>
     <w:lsdException w:name="Table Web 1" w:semiHidden="1" w:unhideWhenUsed="1"/>
+    <w:lsdException w:name="Table Web 2" w:semiHidden="1" w:unhideWhenUsed="1"/>
+    <w:lsdException w:name="Table Web 3" w:semiHidden="1" w:unhideWhenUsed="1"/>
     <w:lsdException w:name="Balloon Text" w:semiHidden="1" w:unhideWhenUsed="1"/>
     <w:lsdException w:name="Table Grid" w:uiPriority="39"/>
     <w:lsdException w:name="Table Theme" w:semiHidden="1" w:unhideWhenUsed="1"/>

</xml_diff>